<commit_message>
blackboxai/gotenberg-templates: Force DOCX templates with Gotenberg to fix deploy format issue - Enable Gotenberg in application.properties - Integrate Gotenberg HTTP client in DocumentoGeneradoService - Remove dummy PDF fallback - Add docker-compose.yml for testing/deploy
</commit_message>
<xml_diff>
--- a/backend/src/main/resources/templates/RESPUESTA NEGATIVA.docx
+++ b/backend/src/main/resources/templates/RESPUESTA NEGATIVA.docx
@@ -426,15 +426,6 @@
     </w:p>
     <w:p>
       <w:pPr>
-        <w:ind w:left="-709"/>
-        <w:rPr>
-          <w:rFonts w:ascii="Maven Pro" w:hAnsi="Maven Pro" w:cs="Tahoma"/>
-        </w:rPr>
-      </w:pPr>
-    </w:p>
-    <w:p>
-      <w:pPr>
-        <w:ind w:left="-709"/>
         <w:rPr>
           <w:rFonts w:ascii="Maven Pro" w:hAnsi="Maven Pro" w:cs="Tahoma"/>
         </w:rPr>

</xml_diff>